<commit_message>
feat(documentero): apostille guide, real figure on Despre, brand-aware unsubscribe page, contract without the stale T&C hyperlink, orders.platform in Supabase types
Co-Authored-By: Claude Fable 5.1 <noreply@anthropic.com>
</commit_message>
<xml_diff>
--- a/src/templates/shared/contract-prestari.docx
+++ b/src/templates/shared/contract-prestari.docx
@@ -870,17 +870,15 @@
         </w:rPr>
         <w:t xml:space="preserve">9.3.Termenii prezentului contract sunt completate de termenii și condițiile disponibile pe </w:t>
       </w:r>
-      <w:hyperlink r:id="rId6">
-        <w:r>
-          <w:rPr>
-            <w:rFonts w:ascii="Times New Roman" w:cs="Times New Roman" w:eastAsia="Times New Roman" w:hAnsi="Times New Roman"/>
-            <w:color w:val="1155cc"/>
-            <w:u w:val="single"/>
-            <w:rtl w:val="0"/>
-          </w:rPr>
-          <w:t xml:space="preserve">{{TC_URL}}</w:t>
-        </w:r>
-      </w:hyperlink>
+      <w:r>
+        <w:rPr>
+          <w:rFonts w:ascii="Times New Roman" w:cs="Times New Roman" w:eastAsia="Times New Roman" w:hAnsi="Times New Roman"/>
+          <w:color w:val="1155cc"/>
+          <w:u w:val="single"/>
+          <w:rtl w:val="0"/>
+        </w:rPr>
+        <w:t xml:space="preserve">{{TC_URL}}</w:t>
+      </w:r>
       <w:r>
         <w:rPr>
           <w:rFonts w:ascii="Times New Roman" w:cs="Times New Roman" w:eastAsia="Times New Roman" w:hAnsi="Times New Roman"/>

</xml_diff>